<commit_message>
Corrige la sangría de las secciones y la alineación de las tablas
</commit_message>
<xml_diff>
--- a/plugins/irem/skills/irem-word-formato/plantilla.docx
+++ b/plugins/irem/skills/irem-word-formato/plantilla.docx
@@ -290,10 +290,11 @@
     <w:lvl w:ilvl="0" w:tplc="280A0013">
       <w:start w:val="1"/>
       <w:numFmt w:val="upperRoman"/>
+      <w:suff w:val="space"/>
       <w:lvlText w:val="%1."/>
-      <w:lvlJc w:val="right"/>
-      <w:pPr>
-        <w:ind w:left="720" w:hanging="360"/>
+      <w:lvlJc w:val="left"/>
+      <w:pPr>
+        <w:ind w:left="0" w:hanging="0"/>
       </w:pPr>
     </w:lvl>
     <w:lvl w:ilvl="1" w:tplc="280A0019" w:tentative="1">

</xml_diff>